<commit_message>
Fix audit-type checkboxes in FR.232/231/229 (Initial/Surv/Recert/Special)
Both Jinja branches in the audit-type row were emitting the literal text
'FORMCHECKBOX' (the legacy field widgets had been pasted into the string
literals on each side of the conditional), so the document always rendered
the same garbled text regardless of audit_type.

scripts/fix_formcheckbox_templates.py walks the audit-type paragraph, drops
the legacy <w:fldChar>/<w:checkBox> widgets and rewrites it as:
  {{ "☑" if is_initial else "☐" }} Initial Certification  …

Verified render: ☑ Initial Certification  ☐ Surveillance  ☐ Recertification  ☐ Special

FR.220/FR.221 standard-grid checkboxes were already covered by
apply_checkbox_selection in packager.py (Task ①).

Tests: 8/8 pass.
</commit_message>
<xml_diff>
--- a/backend/uaf_blank_set/13485/Initial Certification /Stage 1/FR.231-1_MD-QMS Stage 1 Report R1&09.10.2025.docx
+++ b/backend/uaf_blank_set/13485/Initial Certification /Stage 1/FR.231-1_MD-QMS Stage 1 Report R1&09.10.2025.docx
@@ -2561,195 +2561,7 @@
               </w:rPr>
             </w:pPr>
             <w:r>
-              <w:rPr>
-                <w:rFonts w:ascii="Times New Roman" w:hAnsi="Times New Roman"/>
-                <w:sz w:val="20"/>
-              </w:rPr>
-              <w:t>{{ "</w:t>
-            </w:r>
-            <w:r>
-              <w:rPr>
-                <w:rFonts w:ascii="Times New Roman" w:hAnsi="Times New Roman"/>
-                <w:sz w:val="20"/>
-                <w:lang w:val="en-US"/>
-              </w:rPr>
-              <w:fldChar w:fldCharType="begin">
-                <w:ffData>
-                  <w:name w:val=""/>
-                  <w:enabled/>
-                  <w:calcOnExit w:val="0"/>
-                  <w:checkBox>
-                    <w:sizeAuto/>
-                    <w:default w:val="1"/>
-                  </w:checkBox>
-                </w:ffData>
-              </w:fldChar>
-            </w:r>
-            <w:r>
-              <w:rPr>
-                <w:rFonts w:ascii="Times New Roman" w:hAnsi="Times New Roman"/>
-                <w:sz w:val="20"/>
-                <w:lang w:val="en-US"/>
-              </w:rPr>
-              <w:instrText xml:space="preserve"> FORMCHECKBOX </w:instrText>
-            </w:r>
-            <w:r>
-              <w:rPr>
-                <w:rFonts w:ascii="Times New Roman" w:hAnsi="Times New Roman"/>
-                <w:sz w:val="20"/>
-                <w:lang w:val="en-US"/>
-              </w:rPr>
-            </w:r>
-            <w:r>
-              <w:rPr>
-                <w:rFonts w:ascii="Times New Roman" w:hAnsi="Times New Roman"/>
-                <w:sz w:val="20"/>
-                <w:lang w:val="en-US"/>
-              </w:rPr>
-              <w:fldChar w:fldCharType="separate"/>
-            </w:r>
-            <w:r>
-              <w:rPr>
-                <w:rFonts w:ascii="Times New Roman" w:hAnsi="Times New Roman"/>
-                <w:sz w:val="20"/>
-                <w:lang w:val="en-US"/>
-              </w:rPr>
-              <w:fldChar w:fldCharType="end"/>
-            </w:r>
-            <w:r>
-              <w:rPr>
-                <w:rFonts w:ascii="Times New Roman" w:hAnsi="Times New Roman"/>
-                <w:sz w:val="20"/>
-                <w:lang w:val="en-US"/>
-              </w:rPr>
-              <w:t xml:space="preserve"> </w:t>
-            </w:r>
-            <w:r>
-              <w:rPr>
-                <w:rFonts w:ascii="Times New Roman" w:hAnsi="Times New Roman"/>
-                <w:sz w:val="20"/>
-              </w:rPr>
-              <w:t xml:space="preserve">" </w:t>
-            </w:r>
-            <w:r>
-              <w:rPr>
-                <w:rFonts w:ascii="Times New Roman" w:hAnsi="Times New Roman"/>
-                <w:sz w:val="20"/>
-              </w:rPr>
-              <w:t>if</w:t>
-            </w:r>
-            <w:r>
-              <w:rPr>
-                <w:rFonts w:ascii="Times New Roman" w:hAnsi="Times New Roman"/>
-                <w:sz w:val="20"/>
-              </w:rPr>
-              <w:t xml:space="preserve"> </w:t>
-            </w:r>
-            <w:r>
-              <w:rPr>
-                <w:rFonts w:ascii="Times New Roman" w:hAnsi="Times New Roman"/>
-                <w:sz w:val="20"/>
-              </w:rPr>
-              <w:t>is_initial</w:t>
-            </w:r>
-            <w:r>
-              <w:rPr>
-                <w:rFonts w:ascii="Times New Roman" w:hAnsi="Times New Roman"/>
-                <w:sz w:val="20"/>
-              </w:rPr>
-              <w:t xml:space="preserve"> else "</w:t>
-            </w:r>
-            <w:r>
-              <w:rPr>
-                <w:rFonts w:ascii="Times New Roman" w:hAnsi="Times New Roman"/>
-                <w:sz w:val="20"/>
-                <w:lang w:val="en-US"/>
-              </w:rPr>
-              <w:fldChar w:fldCharType="begin">
-                <w:ffData>
-                  <w:name w:val=""/>
-                  <w:enabled/>
-                  <w:calcOnExit w:val="0"/>
-                  <w:checkBox>
-                    <w:sizeAuto/>
-                    <w:default w:val="0"/>
-                  </w:checkBox>
-                </w:ffData>
-              </w:fldChar>
-            </w:r>
-            <w:r>
-              <w:rPr>
-                <w:rFonts w:ascii="Times New Roman" w:hAnsi="Times New Roman"/>
-                <w:sz w:val="20"/>
-                <w:lang w:val="en-US"/>
-              </w:rPr>
-              <w:instrText xml:space="preserve"> FORMCHECKBOX </w:instrText>
-            </w:r>
-            <w:r>
-              <w:rPr>
-                <w:rFonts w:ascii="Times New Roman" w:hAnsi="Times New Roman"/>
-                <w:sz w:val="20"/>
-                <w:lang w:val="en-US"/>
-              </w:rPr>
-            </w:r>
-            <w:r>
-              <w:rPr>
-                <w:rFonts w:ascii="Times New Roman" w:hAnsi="Times New Roman"/>
-                <w:sz w:val="20"/>
-                <w:lang w:val="en-US"/>
-              </w:rPr>
-              <w:fldChar w:fldCharType="separate"/>
-            </w:r>
-            <w:r>
-              <w:rPr>
-                <w:rFonts w:ascii="Times New Roman" w:hAnsi="Times New Roman"/>
-                <w:sz w:val="20"/>
-                <w:lang w:val="en-US"/>
-              </w:rPr>
-              <w:fldChar w:fldCharType="end"/>
-            </w:r>
-            <w:r>
-              <w:rPr>
-                <w:rFonts w:ascii="Times New Roman" w:hAnsi="Times New Roman"/>
-                <w:sz w:val="20"/>
-                <w:lang w:val="en-US"/>
-              </w:rPr>
-              <w:t xml:space="preserve"> </w:t>
-            </w:r>
-            <w:r>
-              <w:rPr>
-                <w:rFonts w:ascii="Times New Roman" w:hAnsi="Times New Roman"/>
-                <w:sz w:val="20"/>
-              </w:rPr>
-              <w:t>" }</w:t>
-            </w:r>
-            <w:r>
-              <w:rPr>
-                <w:rFonts w:ascii="Times New Roman" w:hAnsi="Times New Roman"/>
-                <w:sz w:val="20"/>
-              </w:rPr>
-              <w:t xml:space="preserve">} </w:t>
-            </w:r>
-            <w:r>
-              <w:rPr>
-                <w:rFonts w:ascii="Times New Roman" w:hAnsi="Times New Roman"/>
-                <w:sz w:val="20"/>
-              </w:rPr>
-              <w:t>Initial</w:t>
-            </w:r>
-            <w:r>
-              <w:rPr>
-                <w:rFonts w:ascii="Times New Roman" w:hAnsi="Times New Roman"/>
-                <w:sz w:val="20"/>
-              </w:rPr>
-              <w:t xml:space="preserve"> </w:t>
-            </w:r>
-            <w:r>
-              <w:rPr>
-                <w:rFonts w:ascii="Times New Roman" w:hAnsi="Times New Roman"/>
-                <w:sz w:val="20"/>
-              </w:rPr>
-              <w:t>Certification</w:t>
+              <w:t xml:space="preserve">{{ "☑" if is_initial else "☐" }} Initial Certification</w:t>
             </w:r>
           </w:p>
         </w:tc>
@@ -2767,165 +2579,7 @@
               </w:rPr>
             </w:pPr>
             <w:r>
-              <w:rPr>
-                <w:rStyle w:val="HTMLCode"/>
-                <w:rFonts w:ascii="Times New Roman" w:eastAsia="Calibri" w:hAnsi="Times New Roman" w:cs="Times New Roman"/>
-              </w:rPr>
-              <w:t>{{ "</w:t>
-            </w:r>
-            <w:r>
-              <w:rPr>
-                <w:rFonts w:ascii="Times New Roman" w:hAnsi="Times New Roman"/>
-                <w:sz w:val="20"/>
-                <w:lang w:val="en-US"/>
-              </w:rPr>
-              <w:fldChar w:fldCharType="begin">
-                <w:ffData>
-                  <w:name w:val=""/>
-                  <w:enabled/>
-                  <w:calcOnExit w:val="0"/>
-                  <w:checkBox>
-                    <w:sizeAuto/>
-                    <w:default w:val="1"/>
-                  </w:checkBox>
-                </w:ffData>
-              </w:fldChar>
-            </w:r>
-            <w:r>
-              <w:rPr>
-                <w:rFonts w:ascii="Times New Roman" w:hAnsi="Times New Roman"/>
-                <w:sz w:val="20"/>
-                <w:lang w:val="en-US"/>
-              </w:rPr>
-              <w:instrText xml:space="preserve"> FORMCHECKBOX </w:instrText>
-            </w:r>
-            <w:r>
-              <w:rPr>
-                <w:rFonts w:ascii="Times New Roman" w:hAnsi="Times New Roman"/>
-                <w:sz w:val="20"/>
-                <w:lang w:val="en-US"/>
-              </w:rPr>
-            </w:r>
-            <w:r>
-              <w:rPr>
-                <w:rFonts w:ascii="Times New Roman" w:hAnsi="Times New Roman"/>
-                <w:sz w:val="20"/>
-                <w:lang w:val="en-US"/>
-              </w:rPr>
-              <w:fldChar w:fldCharType="separate"/>
-            </w:r>
-            <w:r>
-              <w:rPr>
-                <w:rFonts w:ascii="Times New Roman" w:hAnsi="Times New Roman"/>
-                <w:sz w:val="20"/>
-                <w:lang w:val="en-US"/>
-              </w:rPr>
-              <w:fldChar w:fldCharType="end"/>
-            </w:r>
-            <w:r>
-              <w:rPr>
-                <w:rStyle w:val="HTMLCode"/>
-                <w:rFonts w:ascii="Times New Roman" w:eastAsia="Calibri" w:hAnsi="Times New Roman" w:cs="Times New Roman"/>
-              </w:rPr>
-              <w:t xml:space="preserve">" </w:t>
-            </w:r>
-            <w:r>
-              <w:rPr>
-                <w:rStyle w:val="HTMLCode"/>
-                <w:rFonts w:ascii="Times New Roman" w:eastAsia="Calibri" w:hAnsi="Times New Roman" w:cs="Times New Roman"/>
-              </w:rPr>
-              <w:t>if</w:t>
-            </w:r>
-            <w:r>
-              <w:rPr>
-                <w:rStyle w:val="HTMLCode"/>
-                <w:rFonts w:ascii="Times New Roman" w:eastAsia="Calibri" w:hAnsi="Times New Roman" w:cs="Times New Roman"/>
-              </w:rPr>
-              <w:t xml:space="preserve"> </w:t>
-            </w:r>
-            <w:r>
-              <w:rPr>
-                <w:rStyle w:val="HTMLCode"/>
-                <w:rFonts w:ascii="Times New Roman" w:eastAsia="Calibri" w:hAnsi="Times New Roman" w:cs="Times New Roman"/>
-              </w:rPr>
-              <w:t>is_recertification</w:t>
-            </w:r>
-            <w:r>
-              <w:rPr>
-                <w:rStyle w:val="HTMLCode"/>
-                <w:rFonts w:ascii="Times New Roman" w:eastAsia="Calibri" w:hAnsi="Times New Roman" w:cs="Times New Roman"/>
-              </w:rPr>
-              <w:t xml:space="preserve"> else "</w:t>
-            </w:r>
-            <w:r>
-              <w:rPr>
-                <w:rFonts w:ascii="Times New Roman" w:hAnsi="Times New Roman"/>
-                <w:sz w:val="20"/>
-                <w:lang w:val="en-US"/>
-              </w:rPr>
-              <w:fldChar w:fldCharType="begin">
-                <w:ffData>
-                  <w:name w:val=""/>
-                  <w:enabled/>
-                  <w:calcOnExit w:val="0"/>
-                  <w:checkBox>
-                    <w:sizeAuto/>
-                    <w:default w:val="0"/>
-                  </w:checkBox>
-                </w:ffData>
-              </w:fldChar>
-            </w:r>
-            <w:r>
-              <w:rPr>
-                <w:rFonts w:ascii="Times New Roman" w:hAnsi="Times New Roman"/>
-                <w:sz w:val="20"/>
-                <w:lang w:val="en-US"/>
-              </w:rPr>
-              <w:instrText xml:space="preserve"> FORMCHECKBOX </w:instrText>
-            </w:r>
-            <w:r>
-              <w:rPr>
-                <w:rFonts w:ascii="Times New Roman" w:hAnsi="Times New Roman"/>
-                <w:sz w:val="20"/>
-                <w:lang w:val="en-US"/>
-              </w:rPr>
-            </w:r>
-            <w:r>
-              <w:rPr>
-                <w:rFonts w:ascii="Times New Roman" w:hAnsi="Times New Roman"/>
-                <w:sz w:val="20"/>
-                <w:lang w:val="en-US"/>
-              </w:rPr>
-              <w:fldChar w:fldCharType="separate"/>
-            </w:r>
-            <w:r>
-              <w:rPr>
-                <w:rFonts w:ascii="Times New Roman" w:hAnsi="Times New Roman"/>
-                <w:sz w:val="20"/>
-                <w:lang w:val="en-US"/>
-              </w:rPr>
-              <w:fldChar w:fldCharType="end"/>
-            </w:r>
-            <w:r>
-              <w:rPr>
-                <w:rStyle w:val="HTMLCode"/>
-                <w:rFonts w:ascii="Times New Roman" w:eastAsia="Calibri" w:hAnsi="Times New Roman" w:cs="Times New Roman"/>
-              </w:rPr>
-              <w:t>" }</w:t>
-            </w:r>
-            <w:r>
-              <w:rPr>
-                <w:rStyle w:val="HTMLCode"/>
-                <w:rFonts w:ascii="Times New Roman" w:eastAsia="Calibri" w:hAnsi="Times New Roman" w:cs="Times New Roman"/>
-              </w:rPr>
-              <w:t xml:space="preserve">} </w:t>
-            </w:r>
-            <w:r>
-              <w:rPr>
-                <w:rStyle w:val="HTMLCode"/>
-                <w:rFonts w:ascii="Times New Roman" w:eastAsia="Calibri" w:hAnsi="Times New Roman" w:cs="Times New Roman"/>
-              </w:rPr>
-              <w:t>Recertification</w:t>
+              <w:t xml:space="preserve">{{ "☑" if is_recertification else "☐" }} Recertification</w:t>
             </w:r>
           </w:p>
         </w:tc>

</xml_diff>